<commit_message>
do some imp changes
</commit_message>
<xml_diff>
--- a/Interactive_Compiler_Synopsis.docx
+++ b/Interactive_Compiler_Synopsis.docx
@@ -6,6 +6,8 @@
       <w:pPr>
         <w:spacing w:after="480"/>
       </w:pPr>
+      <w:bookmarkStart w:id="0" w:name="_GoBack"/>
+      <w:bookmarkEnd w:id="0"/>
     </w:p>
     <w:p>
       <w:pPr>
@@ -486,8 +488,6 @@
               </w:rPr>
               <w:t>2025 – 2026</w:t>
             </w:r>
-            <w:bookmarkStart w:id="0" w:name="_GoBack"/>
-            <w:bookmarkEnd w:id="0"/>
           </w:p>
         </w:tc>
       </w:tr>
@@ -629,7 +629,7 @@
     </w:p>
     <w:p>
       <w:pPr>
-        <w:pStyle w:val="16"/>
+        <w:pStyle w:val="17"/>
         <w:numPr>
           <w:ilvl w:val="0"/>
           <w:numId w:val="1"/>
@@ -647,7 +647,7 @@
     </w:p>
     <w:p>
       <w:pPr>
-        <w:pStyle w:val="16"/>
+        <w:pStyle w:val="17"/>
         <w:numPr>
           <w:ilvl w:val="0"/>
           <w:numId w:val="1"/>
@@ -665,7 +665,7 @@
     </w:p>
     <w:p>
       <w:pPr>
-        <w:pStyle w:val="16"/>
+        <w:pStyle w:val="17"/>
         <w:numPr>
           <w:ilvl w:val="0"/>
           <w:numId w:val="1"/>
@@ -683,7 +683,7 @@
     </w:p>
     <w:p>
       <w:pPr>
-        <w:pStyle w:val="16"/>
+        <w:pStyle w:val="17"/>
         <w:numPr>
           <w:ilvl w:val="0"/>
           <w:numId w:val="1"/>
@@ -747,7 +747,7 @@
     </w:p>
     <w:p>
       <w:pPr>
-        <w:pStyle w:val="16"/>
+        <w:pStyle w:val="17"/>
         <w:numPr>
           <w:ilvl w:val="0"/>
           <w:numId w:val="1"/>
@@ -765,7 +765,7 @@
     </w:p>
     <w:p>
       <w:pPr>
-        <w:pStyle w:val="16"/>
+        <w:pStyle w:val="17"/>
         <w:numPr>
           <w:ilvl w:val="0"/>
           <w:numId w:val="1"/>
@@ -783,7 +783,7 @@
     </w:p>
     <w:p>
       <w:pPr>
-        <w:pStyle w:val="16"/>
+        <w:pStyle w:val="17"/>
         <w:numPr>
           <w:ilvl w:val="0"/>
           <w:numId w:val="1"/>
@@ -801,7 +801,7 @@
     </w:p>
     <w:p>
       <w:pPr>
-        <w:pStyle w:val="16"/>
+        <w:pStyle w:val="17"/>
         <w:numPr>
           <w:ilvl w:val="0"/>
           <w:numId w:val="1"/>
@@ -819,7 +819,7 @@
     </w:p>
     <w:p>
       <w:pPr>
-        <w:pStyle w:val="16"/>
+        <w:pStyle w:val="17"/>
         <w:numPr>
           <w:ilvl w:val="0"/>
           <w:numId w:val="1"/>
@@ -837,7 +837,7 @@
     </w:p>
     <w:p>
       <w:pPr>
-        <w:pStyle w:val="16"/>
+        <w:pStyle w:val="17"/>
         <w:numPr>
           <w:ilvl w:val="0"/>
           <w:numId w:val="1"/>
@@ -855,7 +855,7 @@
     </w:p>
     <w:p>
       <w:pPr>
-        <w:pStyle w:val="16"/>
+        <w:pStyle w:val="17"/>
         <w:numPr>
           <w:ilvl w:val="0"/>
           <w:numId w:val="1"/>
@@ -920,7 +920,7 @@
     </w:p>
     <w:p>
       <w:pPr>
-        <w:pStyle w:val="16"/>
+        <w:pStyle w:val="17"/>
         <w:numPr>
           <w:ilvl w:val="0"/>
           <w:numId w:val="1"/>
@@ -938,7 +938,7 @@
     </w:p>
     <w:p>
       <w:pPr>
-        <w:pStyle w:val="16"/>
+        <w:pStyle w:val="17"/>
         <w:numPr>
           <w:ilvl w:val="0"/>
           <w:numId w:val="1"/>
@@ -956,7 +956,7 @@
     </w:p>
     <w:p>
       <w:pPr>
-        <w:pStyle w:val="16"/>
+        <w:pStyle w:val="17"/>
         <w:numPr>
           <w:ilvl w:val="0"/>
           <w:numId w:val="1"/>
@@ -974,7 +974,7 @@
     </w:p>
     <w:p>
       <w:pPr>
-        <w:pStyle w:val="16"/>
+        <w:pStyle w:val="17"/>
         <w:numPr>
           <w:ilvl w:val="0"/>
           <w:numId w:val="1"/>
@@ -992,7 +992,7 @@
     </w:p>
     <w:p>
       <w:pPr>
-        <w:pStyle w:val="16"/>
+        <w:pStyle w:val="17"/>
         <w:numPr>
           <w:ilvl w:val="0"/>
           <w:numId w:val="1"/>
@@ -1010,7 +1010,7 @@
     </w:p>
     <w:p>
       <w:pPr>
-        <w:pStyle w:val="16"/>
+        <w:pStyle w:val="17"/>
         <w:numPr>
           <w:ilvl w:val="0"/>
           <w:numId w:val="1"/>
@@ -1028,7 +1028,7 @@
     </w:p>
     <w:p>
       <w:pPr>
-        <w:pStyle w:val="16"/>
+        <w:pStyle w:val="17"/>
         <w:numPr>
           <w:ilvl w:val="0"/>
           <w:numId w:val="1"/>
@@ -1046,7 +1046,7 @@
     </w:p>
     <w:p>
       <w:pPr>
-        <w:pStyle w:val="16"/>
+        <w:pStyle w:val="17"/>
         <w:numPr>
           <w:ilvl w:val="0"/>
           <w:numId w:val="1"/>
@@ -1064,7 +1064,7 @@
     </w:p>
     <w:p>
       <w:pPr>
-        <w:pStyle w:val="16"/>
+        <w:pStyle w:val="17"/>
         <w:numPr>
           <w:ilvl w:val="0"/>
           <w:numId w:val="1"/>
@@ -1099,7 +1099,7 @@
     </w:p>
     <w:p>
       <w:pPr>
-        <w:pStyle w:val="16"/>
+        <w:pStyle w:val="17"/>
         <w:numPr>
           <w:ilvl w:val="0"/>
           <w:numId w:val="1"/>
@@ -1117,7 +1117,7 @@
     </w:p>
     <w:p>
       <w:pPr>
-        <w:pStyle w:val="16"/>
+        <w:pStyle w:val="17"/>
         <w:numPr>
           <w:ilvl w:val="0"/>
           <w:numId w:val="1"/>
@@ -1135,7 +1135,7 @@
     </w:p>
     <w:p>
       <w:pPr>
-        <w:pStyle w:val="16"/>
+        <w:pStyle w:val="17"/>
         <w:numPr>
           <w:ilvl w:val="0"/>
           <w:numId w:val="1"/>
@@ -1153,7 +1153,7 @@
     </w:p>
     <w:p>
       <w:pPr>
-        <w:pStyle w:val="16"/>
+        <w:pStyle w:val="17"/>
         <w:numPr>
           <w:ilvl w:val="0"/>
           <w:numId w:val="1"/>
@@ -1171,7 +1171,7 @@
     </w:p>
     <w:p>
       <w:pPr>
-        <w:pStyle w:val="16"/>
+        <w:pStyle w:val="17"/>
         <w:numPr>
           <w:ilvl w:val="0"/>
           <w:numId w:val="1"/>
@@ -2011,7 +2011,7 @@
     </w:p>
     <w:p>
       <w:pPr>
-        <w:pStyle w:val="16"/>
+        <w:pStyle w:val="17"/>
         <w:numPr>
           <w:ilvl w:val="0"/>
           <w:numId w:val="1"/>
@@ -2029,7 +2029,7 @@
     </w:p>
     <w:p>
       <w:pPr>
-        <w:pStyle w:val="16"/>
+        <w:pStyle w:val="17"/>
         <w:numPr>
           <w:ilvl w:val="0"/>
           <w:numId w:val="1"/>
@@ -2047,7 +2047,7 @@
     </w:p>
     <w:p>
       <w:pPr>
-        <w:pStyle w:val="16"/>
+        <w:pStyle w:val="17"/>
         <w:numPr>
           <w:ilvl w:val="0"/>
           <w:numId w:val="1"/>
@@ -2065,7 +2065,7 @@
     </w:p>
     <w:p>
       <w:pPr>
-        <w:pStyle w:val="16"/>
+        <w:pStyle w:val="17"/>
         <w:numPr>
           <w:ilvl w:val="0"/>
           <w:numId w:val="1"/>
@@ -2083,7 +2083,7 @@
     </w:p>
     <w:p>
       <w:pPr>
-        <w:pStyle w:val="16"/>
+        <w:pStyle w:val="17"/>
         <w:numPr>
           <w:ilvl w:val="0"/>
           <w:numId w:val="1"/>
@@ -2101,7 +2101,7 @@
     </w:p>
     <w:p>
       <w:pPr>
-        <w:pStyle w:val="16"/>
+        <w:pStyle w:val="17"/>
         <w:numPr>
           <w:ilvl w:val="0"/>
           <w:numId w:val="1"/>
@@ -2119,7 +2119,7 @@
     </w:p>
     <w:p>
       <w:pPr>
-        <w:pStyle w:val="16"/>
+        <w:pStyle w:val="17"/>
         <w:numPr>
           <w:ilvl w:val="0"/>
           <w:numId w:val="1"/>
@@ -2214,7 +2214,7 @@
     </w:p>
     <w:p>
       <w:pPr>
-        <w:pStyle w:val="16"/>
+        <w:pStyle w:val="17"/>
         <w:numPr>
           <w:ilvl w:val="0"/>
           <w:numId w:val="1"/>
@@ -2232,7 +2232,7 @@
     </w:p>
     <w:p>
       <w:pPr>
-        <w:pStyle w:val="16"/>
+        <w:pStyle w:val="17"/>
         <w:numPr>
           <w:ilvl w:val="0"/>
           <w:numId w:val="1"/>
@@ -2250,7 +2250,7 @@
     </w:p>
     <w:p>
       <w:pPr>
-        <w:pStyle w:val="16"/>
+        <w:pStyle w:val="17"/>
         <w:numPr>
           <w:ilvl w:val="0"/>
           <w:numId w:val="1"/>
@@ -2268,7 +2268,7 @@
     </w:p>
     <w:p>
       <w:pPr>
-        <w:pStyle w:val="16"/>
+        <w:pStyle w:val="17"/>
         <w:numPr>
           <w:ilvl w:val="0"/>
           <w:numId w:val="1"/>
@@ -2307,7 +2307,7 @@
     </w:p>
     <w:p>
       <w:pPr>
-        <w:pStyle w:val="16"/>
+        <w:pStyle w:val="17"/>
         <w:numPr>
           <w:ilvl w:val="0"/>
           <w:numId w:val="1"/>
@@ -2325,7 +2325,7 @@
     </w:p>
     <w:p>
       <w:pPr>
-        <w:pStyle w:val="16"/>
+        <w:pStyle w:val="17"/>
         <w:numPr>
           <w:ilvl w:val="0"/>
           <w:numId w:val="1"/>
@@ -2343,7 +2343,7 @@
     </w:p>
     <w:p>
       <w:pPr>
-        <w:pStyle w:val="16"/>
+        <w:pStyle w:val="17"/>
         <w:numPr>
           <w:ilvl w:val="0"/>
           <w:numId w:val="1"/>
@@ -2382,7 +2382,7 @@
     </w:p>
     <w:p>
       <w:pPr>
-        <w:pStyle w:val="16"/>
+        <w:pStyle w:val="17"/>
         <w:numPr>
           <w:ilvl w:val="0"/>
           <w:numId w:val="1"/>
@@ -2400,7 +2400,7 @@
     </w:p>
     <w:p>
       <w:pPr>
-        <w:pStyle w:val="16"/>
+        <w:pStyle w:val="17"/>
         <w:numPr>
           <w:ilvl w:val="0"/>
           <w:numId w:val="1"/>
@@ -2464,7 +2464,7 @@
     </w:p>
     <w:p>
       <w:pPr>
-        <w:pStyle w:val="16"/>
+        <w:pStyle w:val="17"/>
         <w:numPr>
           <w:ilvl w:val="0"/>
           <w:numId w:val="1"/>
@@ -2482,7 +2482,7 @@
     </w:p>
     <w:p>
       <w:pPr>
-        <w:pStyle w:val="16"/>
+        <w:pStyle w:val="17"/>
         <w:numPr>
           <w:ilvl w:val="0"/>
           <w:numId w:val="1"/>
@@ -2500,7 +2500,7 @@
     </w:p>
     <w:p>
       <w:pPr>
-        <w:pStyle w:val="16"/>
+        <w:pStyle w:val="17"/>
         <w:numPr>
           <w:ilvl w:val="0"/>
           <w:numId w:val="1"/>
@@ -2518,7 +2518,7 @@
     </w:p>
     <w:p>
       <w:pPr>
-        <w:pStyle w:val="16"/>
+        <w:pStyle w:val="17"/>
         <w:numPr>
           <w:ilvl w:val="0"/>
           <w:numId w:val="1"/>
@@ -2557,7 +2557,7 @@
     </w:p>
     <w:p>
       <w:pPr>
-        <w:pStyle w:val="16"/>
+        <w:pStyle w:val="17"/>
         <w:numPr>
           <w:ilvl w:val="0"/>
           <w:numId w:val="1"/>
@@ -2575,7 +2575,7 @@
     </w:p>
     <w:p>
       <w:pPr>
-        <w:pStyle w:val="16"/>
+        <w:pStyle w:val="17"/>
         <w:numPr>
           <w:ilvl w:val="0"/>
           <w:numId w:val="1"/>
@@ -2593,7 +2593,7 @@
     </w:p>
     <w:p>
       <w:pPr>
-        <w:pStyle w:val="16"/>
+        <w:pStyle w:val="17"/>
         <w:numPr>
           <w:ilvl w:val="0"/>
           <w:numId w:val="1"/>
@@ -2611,7 +2611,7 @@
     </w:p>
     <w:p>
       <w:pPr>
-        <w:pStyle w:val="16"/>
+        <w:pStyle w:val="17"/>
         <w:numPr>
           <w:ilvl w:val="0"/>
           <w:numId w:val="1"/>
@@ -2629,7 +2629,7 @@
     </w:p>
     <w:p>
       <w:pPr>
-        <w:pStyle w:val="16"/>
+        <w:pStyle w:val="17"/>
         <w:numPr>
           <w:ilvl w:val="0"/>
           <w:numId w:val="1"/>
@@ -2750,7 +2750,7 @@
     </w:p>
     <w:p>
       <w:pPr>
-        <w:pStyle w:val="16"/>
+        <w:pStyle w:val="17"/>
         <w:numPr>
           <w:ilvl w:val="0"/>
           <w:numId w:val="2"/>
@@ -2768,7 +2768,7 @@
     </w:p>
     <w:p>
       <w:pPr>
-        <w:pStyle w:val="16"/>
+        <w:pStyle w:val="17"/>
         <w:numPr>
           <w:ilvl w:val="0"/>
           <w:numId w:val="2"/>
@@ -2786,7 +2786,7 @@
     </w:p>
     <w:p>
       <w:pPr>
-        <w:pStyle w:val="16"/>
+        <w:pStyle w:val="17"/>
         <w:numPr>
           <w:ilvl w:val="0"/>
           <w:numId w:val="2"/>
@@ -2804,7 +2804,7 @@
     </w:p>
     <w:p>
       <w:pPr>
-        <w:pStyle w:val="16"/>
+        <w:pStyle w:val="17"/>
         <w:numPr>
           <w:ilvl w:val="0"/>
           <w:numId w:val="2"/>
@@ -2825,6 +2825,7 @@
       <w:footerReference r:id="rId4" w:type="default"/>
       <w:pgSz w:w="11906" w:h="16838"/>
       <w:pgMar w:top="1440" w:right="1440" w:bottom="1440" w:left="1440" w:header="708" w:footer="708" w:gutter="0"/>
+      <w:pgNumType w:fmt="decimal"/>
       <w:cols w:space="720" w:num="1"/>
       <w:docGrid w:linePitch="360" w:charSpace="0"/>
     </w:sectPr>
@@ -2839,16 +2840,190 @@
       <w:pBdr>
         <w:top w:val="single" w:color="2E75B6" w:sz="4" w:space="1"/>
       </w:pBdr>
-      <w:jc w:val="center"/>
+      <w:jc w:val="both"/>
+      <w:rPr>
+        <w:rFonts w:hint="default"/>
+        <w:lang w:val="en-US"/>
+      </w:rPr>
     </w:pPr>
     <w:r>
       <w:rPr>
-        <w:rFonts w:ascii="Arial" w:hAnsi="Arial" w:eastAsia="Arial" w:cs="Arial"/>
+        <w:sz w:val="18"/>
+      </w:rPr>
+      <mc:AlternateContent>
+        <mc:Choice Requires="wps">
+          <w:drawing>
+            <wp:anchor distT="0" distB="0" distL="114300" distR="114300" simplePos="0" relativeHeight="251659264" behindDoc="0" locked="0" layoutInCell="1" allowOverlap="1">
+              <wp:simplePos x="0" y="0"/>
+              <wp:positionH relativeFrom="margin">
+                <wp:align>right</wp:align>
+              </wp:positionH>
+              <wp:positionV relativeFrom="paragraph">
+                <wp:posOffset>0</wp:posOffset>
+              </wp:positionV>
+              <wp:extent cx="1828800" cy="1828800"/>
+              <wp:effectExtent l="0" t="0" r="0" b="0"/>
+              <wp:wrapNone/>
+              <wp:docPr id="1" name="Text Box 1"/>
+              <wp:cNvGraphicFramePr/>
+              <a:graphic xmlns:a="http://schemas.openxmlformats.org/drawingml/2006/main">
+                <a:graphicData uri="http://schemas.microsoft.com/office/word/2010/wordprocessingShape">
+                  <wps:wsp>
+                    <wps:cNvSpPr txBox="1"/>
+                    <wps:spPr>
+                      <a:xfrm>
+                        <a:off x="0" y="0"/>
+                        <a:ext cx="1828800" cy="1828800"/>
+                      </a:xfrm>
+                      <a:prstGeom prst="rect">
+                        <a:avLst/>
+                      </a:prstGeom>
+                      <a:noFill/>
+                      <a:ln w="6350">
+                        <a:noFill/>
+                      </a:ln>
+                      <a:extLst>
+                        <a:ext uri="{909E8E84-426E-40DD-AFC4-6F175D3DCCD1}">
+                          <a14:hiddenFill xmlns:a14="http://schemas.microsoft.com/office/drawing/2010/main">
+                            <a:solidFill>
+                              <a:schemeClr val="lt1"/>
+                            </a:solidFill>
+                          </a14:hiddenFill>
+                        </a:ext>
+                        <a:ext uri="{91240B29-F687-4F45-9708-019B960494DF}">
+                          <a14:hiddenLine xmlns:a14="http://schemas.microsoft.com/office/drawing/2010/main" w="6350">
+                            <a:solidFill>
+                              <a:prstClr val="black"/>
+                            </a:solidFill>
+                          </a14:hiddenLine>
+                        </a:ext>
+                      </a:extLst>
+                    </wps:spPr>
+                    <wps:style>
+                      <a:lnRef idx="0">
+                        <a:schemeClr val="accent1"/>
+                      </a:lnRef>
+                      <a:fillRef idx="0">
+                        <a:schemeClr val="accent1"/>
+                      </a:fillRef>
+                      <a:effectRef idx="0">
+                        <a:schemeClr val="accent1"/>
+                      </a:effectRef>
+                      <a:fontRef idx="minor">
+                        <a:schemeClr val="dk1"/>
+                      </a:fontRef>
+                    </wps:style>
+                    <wps:txbx>
+                      <w:txbxContent>
+                        <w:p>
+                          <w:pPr>
+                            <w:pStyle w:val="12"/>
+                          </w:pPr>
+                          <w:r>
+                            <w:fldChar w:fldCharType="begin"/>
+                          </w:r>
+                          <w:r>
+                            <w:instrText xml:space="preserve"> PAGE  \* MERGEFORMAT </w:instrText>
+                          </w:r>
+                          <w:r>
+                            <w:fldChar w:fldCharType="separate"/>
+                          </w:r>
+                          <w:r>
+                            <w:t>1</w:t>
+                          </w:r>
+                          <w:r>
+                            <w:fldChar w:fldCharType="end"/>
+                          </w:r>
+                        </w:p>
+                      </w:txbxContent>
+                    </wps:txbx>
+                    <wps:bodyPr rot="0" spcFirstLastPara="0" vertOverflow="overflow" horzOverflow="overflow" vert="horz" wrap="none" lIns="0" tIns="0" rIns="0" bIns="0" numCol="1" spcCol="0" rtlCol="0" fromWordArt="0" anchor="t" anchorCtr="0" forceAA="0" upright="0" compatLnSpc="1">
+                      <a:spAutoFit/>
+                    </wps:bodyPr>
+                  </wps:wsp>
+                </a:graphicData>
+              </a:graphic>
+            </wp:anchor>
+          </w:drawing>
+        </mc:Choice>
+        <mc:Fallback>
+          <w:pict>
+            <v:shape id="_x0000_s1026" o:spid="_x0000_s1026" o:spt="202" type="#_x0000_t202" style="position:absolute;left:0pt;margin-top:0pt;height:144pt;width:144pt;mso-position-horizontal:right;mso-position-horizontal-relative:margin;mso-wrap-style:none;z-index:251659264;mso-width-relative:page;mso-height-relative:page;" filled="f" stroked="f" coordsize="21600,21600" o:gfxdata="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">
+              <v:fill on="f" focussize="0,0"/>
+              <v:stroke on="f" weight="0.5pt"/>
+              <v:imagedata o:title=""/>
+              <o:lock v:ext="edit" aspectratio="f"/>
+              <v:textbox inset="0mm,0mm,0mm,0mm" style="mso-fit-shape-to-text:t;">
+                <w:txbxContent>
+                  <w:p>
+                    <w:pPr>
+                      <w:pStyle w:val="12"/>
+                    </w:pPr>
+                    <w:r>
+                      <w:fldChar w:fldCharType="begin"/>
+                    </w:r>
+                    <w:r>
+                      <w:instrText xml:space="preserve"> PAGE  \* MERGEFORMAT </w:instrText>
+                    </w:r>
+                    <w:r>
+                      <w:fldChar w:fldCharType="separate"/>
+                    </w:r>
+                    <w:r>
+                      <w:t>1</w:t>
+                    </w:r>
+                    <w:r>
+                      <w:fldChar w:fldCharType="end"/>
+                    </w:r>
+                  </w:p>
+                </w:txbxContent>
+              </v:textbox>
+            </v:shape>
+          </w:pict>
+        </mc:Fallback>
+      </mc:AlternateContent>
+    </w:r>
+    <w:r>
+      <w:rPr>
+        <w:rFonts w:hint="default" w:cs="Arial"/>
         <w:color w:val="666666"/>
         <w:sz w:val="18"/>
         <w:szCs w:val="18"/>
+        <w:lang w:val="en-US"/>
       </w:rPr>
-      <w:t xml:space="preserve">Page </w:t>
+      <w:t>Sanyam Kothari</w:t>
+    </w:r>
+    <w:r>
+      <w:rPr>
+        <w:rFonts w:hint="default" w:cs="Arial"/>
+        <w:color w:val="666666"/>
+        <w:sz w:val="18"/>
+        <w:szCs w:val="18"/>
+        <w:lang w:val="en-US"/>
+      </w:rPr>
+      <w:tab/>
+      <w:t/>
+    </w:r>
+    <w:r>
+      <w:rPr>
+        <w:rFonts w:hint="default" w:cs="Arial"/>
+        <w:color w:val="666666"/>
+        <w:sz w:val="18"/>
+        <w:szCs w:val="18"/>
+        <w:lang w:val="en-US"/>
+      </w:rPr>
+      <w:tab/>
+      <w:t/>
+    </w:r>
+    <w:r>
+      <w:rPr>
+        <w:rFonts w:hint="default" w:cs="Arial"/>
+        <w:color w:val="666666"/>
+        <w:sz w:val="18"/>
+        <w:szCs w:val="18"/>
+        <w:lang w:val="en-US"/>
+      </w:rPr>
+      <w:tab/>
+      <w:t>Graphic Era Hill University(</w:t>
     </w:r>
     <w:r>
       <w:rPr>
@@ -2857,43 +3032,61 @@
         <w:sz w:val="18"/>
         <w:szCs w:val="18"/>
       </w:rPr>
-      <w:fldChar w:fldCharType="begin"/>
+      <w:t xml:space="preserve"> CSE 2023-2027</w:t>
     </w:r>
     <w:r>
       <w:rPr>
-        <w:rFonts w:ascii="Arial" w:hAnsi="Arial" w:eastAsia="Arial" w:cs="Arial"/>
+        <w:rFonts w:hint="default" w:cs="Arial"/>
         <w:color w:val="666666"/>
         <w:sz w:val="18"/>
         <w:szCs w:val="18"/>
+        <w:lang w:val="en-US"/>
       </w:rPr>
-      <w:instrText xml:space="preserve">PAGE</w:instrText>
+      <w:t>)</w:t>
     </w:r>
     <w:r>
       <w:rPr>
-        <w:rFonts w:ascii="Arial" w:hAnsi="Arial" w:eastAsia="Arial" w:cs="Arial"/>
+        <w:rFonts w:hint="default" w:cs="Arial"/>
         <w:color w:val="666666"/>
         <w:sz w:val="18"/>
         <w:szCs w:val="18"/>
+        <w:lang w:val="en-US"/>
       </w:rPr>
-      <w:fldChar w:fldCharType="separate"/>
+      <w:tab/>
+      <w:t/>
     </w:r>
     <w:r>
       <w:rPr>
-        <w:rFonts w:ascii="Arial" w:hAnsi="Arial" w:eastAsia="Arial" w:cs="Arial"/>
+        <w:rFonts w:hint="default" w:cs="Arial"/>
         <w:color w:val="666666"/>
         <w:sz w:val="18"/>
         <w:szCs w:val="18"/>
+        <w:lang w:val="en-US"/>
       </w:rPr>
-      <w:fldChar w:fldCharType="end"/>
+      <w:tab/>
+      <w:t/>
     </w:r>
     <w:r>
       <w:rPr>
-        <w:rFonts w:ascii="Arial" w:hAnsi="Arial" w:eastAsia="Arial" w:cs="Arial"/>
+        <w:rFonts w:hint="default" w:cs="Arial"/>
         <w:color w:val="666666"/>
         <w:sz w:val="18"/>
         <w:szCs w:val="18"/>
+        <w:lang w:val="en-US"/>
       </w:rPr>
-      <w:t xml:space="preserve"> | Sanyam Kothari | CSE 2023-2027</w:t>
+      <w:tab/>
+      <w:t/>
+    </w:r>
+    <w:r>
+      <w:rPr>
+        <w:rFonts w:hint="default" w:cs="Arial"/>
+        <w:color w:val="666666"/>
+        <w:sz w:val="18"/>
+        <w:szCs w:val="18"/>
+        <w:lang w:val="en-US"/>
+      </w:rPr>
+      <w:tab/>
+      <w:t xml:space="preserve">  Page No:</w:t>
     </w:r>
   </w:p>
 </w:ftr>
@@ -3357,6 +3550,49 @@
   </w:style>
   <w:style w:type="paragraph" w:styleId="11">
     <w:name w:val="endnote text"/>
+    <w:link w:val="19"/>
+    <w:semiHidden/>
+    <w:unhideWhenUsed/>
+    <w:qFormat/>
+    <w:uiPriority w:val="99"/>
+    <w:pPr>
+      <w:spacing w:after="0" w:line="240" w:lineRule="auto"/>
+    </w:pPr>
+    <w:rPr>
+      <w:rFonts w:ascii="Arial" w:hAnsi="Arial" w:eastAsia="Arial" w:cs="Arial"/>
+      <w:sz w:val="20"/>
+      <w:szCs w:val="20"/>
+    </w:rPr>
+  </w:style>
+  <w:style w:type="paragraph" w:styleId="12">
+    <w:name w:val="footer"/>
+    <w:basedOn w:val="1"/>
+    <w:uiPriority w:val="0"/>
+    <w:pPr>
+      <w:tabs>
+        <w:tab w:val="center" w:pos="4153"/>
+        <w:tab w:val="right" w:pos="8306"/>
+      </w:tabs>
+      <w:snapToGrid w:val="0"/>
+      <w:jc w:val="left"/>
+    </w:pPr>
+    <w:rPr>
+      <w:sz w:val="18"/>
+      <w:szCs w:val="18"/>
+    </w:rPr>
+  </w:style>
+  <w:style w:type="character" w:styleId="13">
+    <w:name w:val="footnote reference"/>
+    <w:semiHidden/>
+    <w:unhideWhenUsed/>
+    <w:qFormat/>
+    <w:uiPriority w:val="99"/>
+    <w:rPr>
+      <w:vertAlign w:val="superscript"/>
+    </w:rPr>
+  </w:style>
+  <w:style w:type="paragraph" w:styleId="14">
+    <w:name w:val="footnote text"/>
     <w:link w:val="18"/>
     <w:semiHidden/>
     <w:unhideWhenUsed/>
@@ -3371,33 +3607,7 @@
       <w:szCs w:val="20"/>
     </w:rPr>
   </w:style>
-  <w:style w:type="character" w:styleId="12">
-    <w:name w:val="footnote reference"/>
-    <w:semiHidden/>
-    <w:unhideWhenUsed/>
-    <w:qFormat/>
-    <w:uiPriority w:val="99"/>
-    <w:rPr>
-      <w:vertAlign w:val="superscript"/>
-    </w:rPr>
-  </w:style>
-  <w:style w:type="paragraph" w:styleId="13">
-    <w:name w:val="footnote text"/>
-    <w:link w:val="17"/>
-    <w:semiHidden/>
-    <w:unhideWhenUsed/>
-    <w:qFormat/>
-    <w:uiPriority w:val="99"/>
-    <w:pPr>
-      <w:spacing w:after="0" w:line="240" w:lineRule="auto"/>
-    </w:pPr>
-    <w:rPr>
-      <w:rFonts w:ascii="Arial" w:hAnsi="Arial" w:eastAsia="Arial" w:cs="Arial"/>
-      <w:sz w:val="20"/>
-      <w:szCs w:val="20"/>
-    </w:rPr>
-  </w:style>
-  <w:style w:type="character" w:styleId="14">
+  <w:style w:type="character" w:styleId="15">
     <w:name w:val="Hyperlink"/>
     <w:unhideWhenUsed/>
     <w:qFormat/>
@@ -3407,7 +3617,7 @@
       <w:u w:val="single"/>
     </w:rPr>
   </w:style>
-  <w:style w:type="paragraph" w:styleId="15">
+  <w:style w:type="paragraph" w:styleId="16">
     <w:name w:val="Title"/>
     <w:qFormat/>
     <w:uiPriority w:val="0"/>
@@ -3417,7 +3627,7 @@
       <w:szCs w:val="56"/>
     </w:rPr>
   </w:style>
-  <w:style w:type="paragraph" w:styleId="16">
+  <w:style w:type="paragraph" w:styleId="17">
     <w:name w:val="List Paragraph"/>
     <w:qFormat/>
     <w:uiPriority w:val="0"/>
@@ -3427,9 +3637,9 @@
       <w:szCs w:val="22"/>
     </w:rPr>
   </w:style>
-  <w:style w:type="character" w:customStyle="1" w:styleId="17">
+  <w:style w:type="character" w:customStyle="1" w:styleId="18">
     <w:name w:val="Footnote Text Char"/>
-    <w:link w:val="13"/>
+    <w:link w:val="14"/>
     <w:semiHidden/>
     <w:unhideWhenUsed/>
     <w:qFormat/>
@@ -3439,7 +3649,7 @@
       <w:szCs w:val="20"/>
     </w:rPr>
   </w:style>
-  <w:style w:type="character" w:customStyle="1" w:styleId="18">
+  <w:style w:type="character" w:customStyle="1" w:styleId="19">
     <w:name w:val="Endnote Text Char"/>
     <w:link w:val="11"/>
     <w:semiHidden/>
@@ -3736,4 +3946,21 @@
   </a:themeElements>
   <a:objectDefaults/>
 </a:theme>
+</file>
+
+<file path=customXml/item1.xml><?xml version="1.0" encoding="utf-8"?>
+<s:customData xmlns="http://www.wps.cn/officeDocument/2013/wpsCustomData" xmlns:s="http://www.wps.cn/officeDocument/2013/wpsCustomData">
+  <customSectProps/>
+  <customShpExts>
+    <customShpInfo spid="_x0000_s1026" textRotate="1"/>
+  </customShpExts>
+</s:customData>
+</file>
+
+<file path=customXml/itemProps1.xml><?xml version="1.0" encoding="utf-8"?>
+<ds:datastoreItem xmlns:ds="http://schemas.openxmlformats.org/officeDocument/2006/customXml" ds:itemID="{B1977F7D-205B-4081-913C-38D41E755F92}">
+  <ds:schemaRefs>
+    <ds:schemaRef ds:uri="http://www.wps.cn/officeDocument/2013/wpsCustomData"/>
+  </ds:schemaRefs>
+</ds:datastoreItem>
 </file>
</xml_diff>